<commit_message>
fix(remote): accept any six-digit demo login code
</commit_message>
<xml_diff>
--- a/public/streaming-mvp/盖世远程PRD-V4.12-Word图片内嵌版.docx
+++ b/public/streaming-mvp/盖世远程PRD-V4.12-Word图片内嵌版.docx
@@ -3953,7 +3953,7 @@
                 <w:b w:val="0"/>
                 <w:i w:val="0"/>
               </w:rPr>
-              <w:t>2. Demo 国内手机号最多11位数字并按11位国内手机号校验；海外邮箱最多254字符，去首尾空格后校验邮箱格式；验证码最多6位数字。空值或格式错误不发送、不提交；未发送、错误或失效验证码不能登录。</w:t>
+              <w:t>2. Demo 国内手机号最多11位数字并按11位国内手机号校验；海外邮箱最多254字符，去首尾空格后校验邮箱格式；验证码最多6位数字。空值或格式错误不发送、不提交；未发送、非6位数字或已失效的验证码请求不能登录。Demo仅校验6位数字格式，不匹配固定码；正式产品仍由账号服务校验真实验证码。 /2026.10.28修改</w:t>
             </w:r>
             <w:r>
               <w:rPr>
@@ -4139,7 +4139,7 @@
                 <w:b w:val="0"/>
                 <w:i w:val="0"/>
               </w:rPr>
-              <w:t>3. 统一演示示例：国内手机号13600008000，海外邮箱player@example.com，验证码123456。填写对应地区账号→点击获取验证码→填写验证码→勾选协议→点击登录；这是推荐演示顺序，未勾选时可获取验证码的规则不变。手机号/邮箱只需符合当前格式校验，不设示例账号白名单，不发送短信或邮件。254字符等为演示限制，正式国家码、长度、邮箱大小写、注册判断、发送间隔和有效期需与盖世账号组件核对。 /2026.10.28修改</w:t>
+              <w:t>3. 统一演示示例：国内手机号13600008000，海外邮箱player@example.com，Demo验证码支持任意6位数字（如000000、654321）。填写对应地区账号→点击获取验证码→填写验证码→勾选协议→点击登录；这是推荐演示顺序，未勾选时可获取验证码的规则不变。手机号/邮箱只需符合当前格式校验，不设示例账号白名单，不发送短信或邮件。254字符等为演示限制，正式国家码、长度、邮箱大小写、注册判断、发送间隔和有效期需与盖世账号组件核对。 /2026.10.28修改</w:t>
             </w:r>
             <w:r>
               <w:rPr>
@@ -16874,7 +16874,7 @@
                 <w:b w:val="0"/>
                 <w:i w:val="0"/>
               </w:rPr>
-              <w:t>2. 国内Demo为+86、11位手机号；海外邮箱最多254字符，去首尾空格后校验格式；验证码最多6位数字。空值/格式错不发送、不提交；未发送、错误或失效不登录。统一演示使用国内手机号13600008000或海外邮箱player@example.com，先获取验证码、填写123456、勾选协议再登录；不发送短信邮件，符合当前格式的其他手机号/邮箱也可模拟登录，不设账号白名单。Mac既有sr-fill填入的13800138000/demo@gamehub.test同样可用。正式规则复用盖世组件并核对。 /2026.10.28修改</w:t>
+              <w:t>2. 国内Demo为+86、11位手机号；海外邮箱最多254字符，去首尾空格后校验格式；验证码最多6位数字。空值/格式错不发送、不提交；未发送、非6位数字或验证码请求失效不登录。仅Demo接受任意6位数字，正式验证码仍由账号服务校验。统一演示使用国内手机号13600008000或海外邮箱player@example.com，先获取验证码、填写任意6位数字、勾选协议再登录；不发送短信邮件，符合当前格式的其他手机号/邮箱也可模拟登录，不设账号白名单。Mac既有sr-fill填入的13800138000/demo@gamehub.test同样可用。正式规则复用盖世组件并核对。 /2026.10.28修改</w:t>
             </w:r>
             <w:r>
               <w:rPr>

</xml_diff>